<commit_message>
docs(assignment-04): sharpen fairness wording and re-render formats
- Q2.1: "cameras" -> "face-recognition systems" to match the Lecture 05 evidence
- Q3.3: replace "name the law" with "which student ends up worse off", tying back to Q2
- lecture-05 README: add a Fairness and Subgroup Analysis section
- re-render 04-assignment.docx and .ipynb from the updated qmd
</commit_message>
<xml_diff>
--- a/assignments/04-assignment.docx
+++ b/assignments/04-assignment.docx
@@ -696,7 +696,7 @@
         <w:t xml:space="preserve">“face obscured”</w:t>
       </w:r>
       <w:r>
-        <w:t xml:space="preserve">) most likely to fire, and say in one sentence what about the camera or the microphone causes it (Lecture 05 covered how cameras perform across skin tones)</w:t>
+        <w:t xml:space="preserve">) most likely to fire, and say in one sentence what about the camera or the microphone causes it (Lecture 05 covered how face-recognition systems perform across skin tones)</w:t>
       </w:r>
     </w:p>
     <w:p>
@@ -876,7 +876,7 @@
         <w:t xml:space="preserve"> </w:t>
       </w:r>
       <w:r>
-        <w:t xml:space="preserve">are what gets counted. Describe what an honest student will do differently in their next exam, and what a cheater will do. What does the count measure after that, and what name did Lecture 05 give to this problem?</w:t>
+        <w:t xml:space="preserve">are what gets counted. Describe what an honest student will do differently in their next exam, and what a cheater will do. What does the count measure once both have adapted, and which kind of student ends up worse off under the new behaviour?</w:t>
       </w:r>
     </w:p>
     <w:p>

</xml_diff>